<commit_message>
Improve profile copy readability and tighten site polish.
Restore readable experience bullets, simplify punctuation across case studies, add writing-style rules, enlarge About experience text, tune hero photo sizing, and regenerate resume files.

Co-authored-by: Cursor <cursoragent@cursor.com>
</commit_message>
<xml_diff>
--- a/public/resume/kerry-hanson-resume.docx
+++ b/public/resume/kerry-hanson-resume.docx
@@ -85,7 +85,7 @@
           <w:sz w:val="19"/>
           <w:szCs w:val="19"/>
         </w:rPr>
-        <w:t xml:space="preserve">Passionate about modernizing UX practice through AI-enabled workflows that accelerate research, prototyping, and design validation while maintaining a strong focus on accessibility, usability, and measurable business outcomes.</w:t>
+        <w:t xml:space="preserve">Passionate about modernizing UX practices through AI-enabled workflows that accelerate research, prototyping, and design validation while maintaining a strong focus on accessibility, usability, and measurable business outcomes.</w:t>
       </w:r>
     </w:p>
     <w:p>
@@ -267,7 +267,7 @@
           <w:sz w:val="19"/>
           <w:szCs w:val="19"/>
         </w:rPr>
-        <w:t xml:space="preserve">Led end-to-end UX for a greenfield enterprise curriculum platform—catalog discovery, curriculum authoring, and course management—replacing legacy workflows for 7+ schools, 50+ academic programs, and hundreds of internal users.</w:t>
+        <w:t xml:space="preserve">Led end-to-end UX for a greenfield enterprise curriculum platform including catalog discovery, curriculum authoring, and course management. Replaced legacy workflows for 7+ schools, 50+ academic programs, and hundreds of internal users.</w:t>
       </w:r>
     </w:p>
     <w:p>
@@ -285,7 +285,7 @@
           <w:sz w:val="19"/>
           <w:szCs w:val="19"/>
         </w:rPr>
-        <w:t xml:space="preserve">Designed curriculum authoring and course management modules—including offering setup, competencies, duplication, and accreditation validations—validated with 30+ academic stakeholders through weekly Power User sessions before engineering handoff.</w:t>
+        <w:t xml:space="preserve">Designed curriculum authoring and course management modules including offering setup, competencies, duplication, and accreditation validations. Validated design with 30+ academic stakeholders through weekly Power User sessions before engineering handoff.</w:t>
       </w:r>
     </w:p>
     <w:p>
@@ -303,7 +303,7 @@
           <w:sz w:val="19"/>
           <w:szCs w:val="19"/>
         </w:rPr>
-        <w:t xml:space="preserve">Planned and facilitated multi-method research on Capella's FlexPath Competency Map and competency-based grading: 4 coach interviews, 138 learner survey responses, and CX support analytics (Qualtrics XM Discover)—synthesized into evidence-based product recommendations.</w:t>
+        <w:t xml:space="preserve">Modernized UX practices by integrating AI into research synthesis, code-based prototyping, and MVP validation, reducing research synthesis and prototyping time by 50%.</w:t>
       </w:r>
     </w:p>
     <w:p>
@@ -321,7 +321,7 @@
           <w:sz w:val="19"/>
           <w:szCs w:val="19"/>
         </w:rPr>
-        <w:t xml:space="preserve">Modernized UX practices by integrating AI into research synthesis, code-based prototyping, and MVP validation—reducing research synthesis time by 60% and design/prototyping time by 50%.</w:t>
+        <w:t xml:space="preserve">Planned and facilitated multi-method UX research on Capella's FlexPath Competency Map and competency-based grading, combining coach interviews, learner surveys, and CX support analytics. Synthesized findings into evidence-based product recommendations.</w:t>
       </w:r>
     </w:p>
     <w:p>
@@ -339,30 +339,7 @@
           <w:sz w:val="19"/>
           <w:szCs w:val="19"/>
         </w:rPr>
-        <w:t xml:space="preserve">Led evolution of the cross-brand Canvas course design system (Strayer, Capella, JWMI)—documented 14 components and patterns, audited 10 courses, trained 30+ learning technologists, and contributed to enterprise usability benchmarking.</w:t>
-      </w:r>
-    </w:p>
-    <w:p>
-      <w:pPr>
-        <w:spacing w:after="40" w:before="80"/>
-      </w:pPr>
-      <w:r>
-        <w:rPr>
-          <w:rFonts w:ascii="Calibri" w:cs="Calibri" w:eastAsia="Calibri" w:hAnsi="Calibri"/>
-          <w:b/>
-          <w:bCs/>
-          <w:sz w:val="19"/>
-          <w:szCs w:val="19"/>
-        </w:rPr>
-        <w:t xml:space="preserve">Interactive Designer</w:t>
-      </w:r>
-      <w:r>
-        <w:rPr>
-          <w:rFonts w:ascii="Calibri" w:cs="Calibri" w:eastAsia="Calibri" w:hAnsi="Calibri"/>
-          <w:sz w:val="18"/>
-          <w:szCs w:val="18"/>
-        </w:rPr>
-        <w:t xml:space="preserve">  July 2017 – December 2023</w:t>
+        <w:t xml:space="preserve">Led the evolution of the Canvas design system used across Strayer, Capella, and JWMI, training 30+ learning technologists.</w:t>
       </w:r>
     </w:p>
     <w:p>
@@ -380,7 +357,30 @@
           <w:sz w:val="19"/>
           <w:szCs w:val="19"/>
         </w:rPr>
-        <w:t xml:space="preserve">Designed reusable interaction patterns, templates, and authoring workflows for a formative media platform producing 1000+ activities across FlexPath, Guided Path, and Strayer—quizzes, video, branching, card sorting, and more—with WCAG-compliant learner-facing components.</w:t>
+        <w:t xml:space="preserve">Contributed to enterprise Canvas usability benchmarking and established UX standards across the organization.</w:t>
+      </w:r>
+    </w:p>
+    <w:p>
+      <w:pPr>
+        <w:spacing w:after="40" w:before="80"/>
+      </w:pPr>
+      <w:r>
+        <w:rPr>
+          <w:rFonts w:ascii="Calibri" w:cs="Calibri" w:eastAsia="Calibri" w:hAnsi="Calibri"/>
+          <w:b/>
+          <w:bCs/>
+          <w:sz w:val="19"/>
+          <w:szCs w:val="19"/>
+        </w:rPr>
+        <w:t xml:space="preserve">Interactive Designer</w:t>
+      </w:r>
+      <w:r>
+        <w:rPr>
+          <w:rFonts w:ascii="Calibri" w:cs="Calibri" w:eastAsia="Calibri" w:hAnsi="Calibri"/>
+          <w:sz w:val="18"/>
+          <w:szCs w:val="18"/>
+        </w:rPr>
+        <w:t xml:space="preserve">  July 2017 – December 2023</w:t>
       </w:r>
     </w:p>
     <w:p>
@@ -398,7 +398,7 @@
           <w:sz w:val="19"/>
           <w:szCs w:val="19"/>
         </w:rPr>
-        <w:t xml:space="preserve">Led learner usability testing across published activities—25 sessions spanning 5 studies (~4 per year)—informing feedback, navigation, and multi-page activity patterns used platform-wide.</w:t>
+        <w:t xml:space="preserve">Led UX research and usability testing of published interactive activities by conducting 5 studies. Findings were used to improve feedback, navigation, and multi-page activity patterns used platform-wide.</w:t>
       </w:r>
     </w:p>
     <w:p>
@@ -416,7 +416,7 @@
           <w:sz w:val="19"/>
           <w:szCs w:val="19"/>
         </w:rPr>
-        <w:t xml:space="preserve">Led UX strategy and redesign for in-context learner feedback at activity completion—pilot response rates rose from ~0% to 10.3%, with 4/5 average satisfaction and 300+ qualitative responses in the first quarterly audit.</w:t>
+        <w:t xml:space="preserve">Designed reusable interaction patterns, templates, and workflows for an interactive media authoring platform. The platform produced 1000+ activities across FlexPath, Guided Path, and Strayer. Patterns included quizzes, video, branching, card sorting, and more. All were built with WCAG-compliant learner-facing components.</w:t>
       </w:r>
     </w:p>
     <w:p>
@@ -434,7 +434,7 @@
           <w:sz w:val="19"/>
           <w:szCs w:val="19"/>
         </w:rPr>
-        <w:t xml:space="preserve">Ensured WCAG compliance across interaction patterns and conducted UX/accessibility audits that improved consistency across digital learning products.</w:t>
+        <w:t xml:space="preserve">Led UX strategy and redesign of in-context learner feedback survey at activity completion. Pilot response rates rose from ~0% to 10.3% and improved qualitative and satisfaction insights.</w:t>
       </w:r>
     </w:p>
     <w:p>
@@ -452,7 +452,25 @@
           <w:sz w:val="19"/>
           <w:szCs w:val="19"/>
         </w:rPr>
-        <w:t xml:space="preserve">Built wireframes, prototypes, and HTML/CSS for learner-facing activities and internal authoring workflows.</w:t>
+        <w:t xml:space="preserve">Designed and developed accessible web applications using wireframes, prototypes, and HTML/CSS.</w:t>
+      </w:r>
+    </w:p>
+    <w:p>
+      <w:pPr>
+        <w:pStyle w:val="ListParagraph"/>
+        <w:numPr>
+          <w:ilvl w:val="0"/>
+          <w:numId w:val="1"/>
+        </w:numPr>
+        <w:spacing w:after="60"/>
+      </w:pPr>
+      <w:r>
+        <w:rPr>
+          <w:rFonts w:ascii="Calibri" w:cs="Calibri" w:eastAsia="Calibri" w:hAnsi="Calibri"/>
+          <w:sz w:val="19"/>
+          <w:szCs w:val="19"/>
+        </w:rPr>
+        <w:t xml:space="preserve">Conducted UX and accessibility audits that improved consistency and usability across digital learning products.</w:t>
       </w:r>
     </w:p>
     <w:p>

</xml_diff>

<commit_message>
Remove site access gate and ship pending content updates.
Open the portfolio publicly by removing the client-side password gate, and include recent profile, resume, and project page improvements.

Co-authored-by: Cursor <cursoragent@cursor.com>
</commit_message>
<xml_diff>
--- a/public/resume/kerry-hanson-resume.docx
+++ b/public/resume/kerry-hanson-resume.docx
@@ -339,7 +339,7 @@
           <w:sz w:val="19"/>
           <w:szCs w:val="19"/>
         </w:rPr>
-        <w:t xml:space="preserve">Led the evolution of the Canvas design system used across Strayer, Capella, and JWMI, training 30+ learning technologists.</w:t>
+        <w:t xml:space="preserve">Led the evolution of the Canvas design system used across Strayer, Capella, and JWMI, trained 30+ learning technologists.</w:t>
       </w:r>
     </w:p>
     <w:p>
@@ -572,7 +572,7 @@
           <w:sz w:val="18"/>
           <w:szCs w:val="18"/>
         </w:rPr>
-        <w:t xml:space="preserve">Developed responsive marketing email templates and landing pages in HubSpot for Thrivent's cuLearn program; built reusable email components and tested templates across email clients for rendering consistency and deliverability.</w:t>
+        <w:t xml:space="preserve">Developed responsive marketing email templates and landing pages in HubSpot for Thrivent's cuLearn program. Built reusable email components and tested templates across email clients for rendering consistency and deliverability.</w:t>
       </w:r>
     </w:p>
     <w:p>
@@ -623,7 +623,7 @@
           <w:sz w:val="18"/>
           <w:szCs w:val="18"/>
         </w:rPr>
-        <w:t xml:space="preserve">Designed and implemented UI updates for the e-commerce site in Demandware (Salesforce Commerce Cloud); produced HTML and CSS for category pages, promotional modules, and responsive layout updates.</w:t>
+        <w:t xml:space="preserve">Designed and implemented UI updates for the e-commerce site in Demandware (Salesforce Commerce Cloud). Produced HTML and CSS for category pages, promotional modules, and responsive layout updates.</w:t>
       </w:r>
     </w:p>
     <w:p>
@@ -725,7 +725,7 @@
           <w:sz w:val="18"/>
           <w:szCs w:val="18"/>
         </w:rPr>
-        <w:t xml:space="preserve">Designed and coded responsive HTML email templates and web/print assets for B2B marketing, product launches, and sales enablement in a regulated industrial environment.</w:t>
+        <w:t xml:space="preserve">Designed and coded responsive HTML email templates and web/print assets for B2B marketing, product launches, and sales enablement.</w:t>
       </w:r>
     </w:p>
     <w:p>
@@ -776,7 +776,7 @@
           <w:sz w:val="18"/>
           <w:szCs w:val="18"/>
         </w:rPr>
-        <w:t xml:space="preserve">Designed UI for Angular-based web applications—from wireframes through visual design, HTML/CSS, and Angular templates for workflows, forms, and dashboard-style interfaces.</w:t>
+        <w:t xml:space="preserve">Designed UI for Angular-based web applications from wireframes through visual design and front-end implementation. Built HTML, CSS, and Angular templates for workflows, forms, and dashboard-style interfaces.</w:t>
       </w:r>
     </w:p>
     <w:p>
@@ -827,7 +827,7 @@
           <w:sz w:val="18"/>
           <w:szCs w:val="18"/>
         </w:rPr>
-        <w:t xml:space="preserve">Designed and maintained iOS, Android, and web applications for 30+ clients over 15 years; led end-to-end delivery as designer, production artist, and project manager including wireframes, prototypes, and HTML/CSS implementation.</w:t>
+        <w:t xml:space="preserve">Designed and maintained iOS, Android, and web applications for 30+ clients over 15 years. Led end-to-end delivery as designer, production artist, and project manager including wireframes, prototypes, and HTML/CSS implementation.</w:t>
       </w:r>
     </w:p>
     <w:p>

</xml_diff>